<commit_message>
v1.8 mechanism-of-injury, neoplasm exclusion, NIS parallel cohort
</commit_message>
<xml_diff>
--- a/Word Tables/Table_NIS2023_Inpatient_Results.docx
+++ b/Word Tables/Table_NIS2023_Inpatient_Results.docx
@@ -50,7 +50,7 @@
           <w:sz w:val="24"/>
           <w:color w:val="333333"/>
         </w:rPr>
-        <w:t xml:space="preserve">NIS 2023 Facial Nerve Repair — Inpatient Database Results</w:t>
+        <w:t xml:space="preserve">NIS 2023 Facial Nerve Repair — Inpatient Database, Traumatic Classification</w:t>
       </w:r>
     </w:p>
     <w:p>
@@ -67,7 +67,7 @@
           <w:sz w:val="20"/>
           <w:color w:val="333333"/>
         </w:rPr>
-        <w:t xml:space="preserve">HCUP National Inpatient Sample, 2023</w:t>
+        <w:t xml:space="preserve">HCUP National Inpatient Sample, 2023 — three-phase analysis</w:t>
       </w:r>
     </w:p>
     <w:tbl xmlns:w="http://schemas.openxmlformats.org/wordprocessingml/2006/main" xmlns:wp="http://schemas.openxmlformats.org/drawingml/2006/wordprocessingDrawing" xmlns:r="http://schemas.openxmlformats.org/officeDocument/2006/relationships" xmlns:w14="http://schemas.microsoft.com/office/word/2010/wordml">
@@ -107,30 +107,7 @@
                 <w:rFonts w:ascii="Calibri" w:hAnsi="Calibri"/>
                 <w:sz w:val="20"/>
               </w:rPr>
-              <w:t xml:space="default">ICD-10-PCS Code</w:t>
-            </w:r>
-          </w:p>
-        </w:tc>
-        <w:tc>
-          <w:tcPr>
-            <w:tcBorders>
-              <w:top w:val="single" w:sz="16" w:space="0" w:color="D3D3D3"/>
-              <w:bottom w:val="single" w:sz="16" w:space="0" w:color="D3D3D3"/>
-            </w:tcBorders>
-            <w:shd w:val="clear" w:color="auto" w:fill="EBF4FB"/>
-          </w:tcPr>
-          <w:p>
-            <w:pPr>
-              <w:spacing w:before="0" w:after="60"/>
-              <w:keepNext/>
-              <w:jc w:val="start"/>
-            </w:pPr>
-            <w:r>
-              <w:rPr>
-                <w:rFonts w:ascii="Calibri" w:hAnsi="Calibri"/>
-                <w:sz w:val="20"/>
-              </w:rPr>
-              <w:t xml:space="default">Description</w:t>
+              <w:t xml:space="default">Category</w:t>
             </w:r>
           </w:p>
         </w:tc>
@@ -189,104 +166,27 @@
         <w:tc>
           <w:tcPr>
             <w:tcBorders>
-              <w:top w:val="single" w:space="0" w:color="D3D3D3"/>
-              <w:bottom w:val="single" w:space="0" w:color="D3D3D3"/>
-              <w:start w:val="single" w:space="0" w:color="D3D3D3"/>
-              <w:end w:val="single" w:space="0" w:color="D3D3D3"/>
-            </w:tcBorders>
-          </w:tcPr>
-          <w:p>
-            <w:pPr>
-              <w:spacing w:before="0" w:after="60"/>
-              <w:keepNext/>
-              <w:jc w:val="start"/>
-            </w:pPr>
-            <w:r>
-              <w:rPr>
-                <w:rFonts w:ascii="Calibri" w:hAnsi="Calibri"/>
-                <w:sz w:val="20"/>
-                <w:color w:val="BEBEBE"/>
-                <w:i/>
-              </w:rPr>
-              <w:t xml:space="default">00QM0ZZ</w:t>
-            </w:r>
-          </w:p>
-        </w:tc>
-        <w:tc>
-          <w:tcPr>
-            <w:tcBorders>
-              <w:top w:val="single" w:space="0" w:color="D3D3D3"/>
-              <w:bottom w:val="single" w:space="0" w:color="D3D3D3"/>
-              <w:start w:val="single" w:space="0" w:color="D3D3D3"/>
-              <w:end w:val="single" w:space="0" w:color="D3D3D3"/>
-            </w:tcBorders>
-          </w:tcPr>
-          <w:p>
-            <w:pPr>
-              <w:spacing w:before="0" w:after="60"/>
-              <w:keepNext/>
-              <w:jc w:val="start"/>
-            </w:pPr>
-            <w:r>
-              <w:rPr>
-                <w:rFonts w:ascii="Calibri" w:hAnsi="Calibri"/>
-                <w:sz w:val="20"/>
-                <w:color w:val="BEBEBE"/>
-                <w:i/>
-              </w:rPr>
-              <w:t xml:space="default">Repair Facial Nerve, Open Approach (CNS section — incorrect)</w:t>
-            </w:r>
-          </w:p>
-        </w:tc>
-        <w:tc>
-          <w:tcPr>
-            <w:tcBorders>
-              <w:top w:val="single" w:space="0" w:color="D3D3D3"/>
-              <w:bottom w:val="single" w:space="0" w:color="D3D3D3"/>
-              <w:start w:val="single" w:space="0" w:color="D3D3D3"/>
-              <w:end w:val="single" w:space="0" w:color="D3D3D3"/>
-            </w:tcBorders>
-          </w:tcPr>
-          <w:p>
-            <w:pPr>
-              <w:spacing w:before="0" w:after="60"/>
-              <w:keepNext/>
-              <w:jc w:val="end"/>
-            </w:pPr>
-            <w:r>
-              <w:rPr>
-                <w:rFonts w:ascii="Calibri" w:hAnsi="Calibri"/>
-                <w:sz w:val="20"/>
-                <w:color w:val="BEBEBE"/>
-                <w:i/>
-              </w:rPr>
-              <w:t xml:space="default">0</w:t>
-            </w:r>
-          </w:p>
-        </w:tc>
-        <w:tc>
-          <w:tcPr>
-            <w:tcBorders>
-              <w:top w:val="single" w:space="0" w:color="D3D3D3"/>
-              <w:bottom w:val="single" w:space="0" w:color="D3D3D3"/>
-              <w:start w:val="single" w:space="0" w:color="D3D3D3"/>
-              <w:end w:val="single" w:space="0" w:color="D3D3D3"/>
-            </w:tcBorders>
-          </w:tcPr>
-          <w:p>
-            <w:pPr>
-              <w:spacing w:before="0" w:after="60"/>
-              <w:keepNext/>
-              <w:jc w:val="end"/>
-            </w:pPr>
-            <w:r>
-              <w:rPr>
-                <w:rFonts w:ascii="Calibri" w:hAnsi="Calibri"/>
-                <w:sz w:val="20"/>
-                <w:color w:val="BEBEBE"/>
-                <w:i/>
-              </w:rPr>
-              <w:t xml:space="default">0</w:t>
+              <w:top w:val="single" w:sz="16" w:space="0" w:color="D3D3D3"/>
+              <w:bottom w:val="single" w:sz="16" w:space="0" w:color="D3D3D3"/>
+              <w:start w:val="single" w:space="0" w:color="D3D3D3"/>
+              <w:end w:val="single" w:space="0" w:color="D3D3D3"/>
+            </w:tcBorders>
+            <w:tcMar>
+              <w:top w:w="25" w:type="dxa"/>
+            </w:tcMar>
+            <w:gridSpan w:val="3"/>
+          </w:tcPr>
+          <w:p>
+            <w:pPr>
+              <w:spacing w:before="0" w:after="60"/>
+              <w:keepNext/>
+            </w:pPr>
+            <w:r>
+              <w:rPr>
+                <w:rFonts w:ascii="Calibri" w:hAnsi="Calibri"/>
+                <w:sz w:val="20"/>
+              </w:rPr>
+              <w:t xml:space="default">ALL FACIAL NERVE REPAIR</w:t>
             </w:r>
           </w:p>
         </w:tc>
@@ -303,6 +203,7 @@
               <w:start w:val="single" w:space="0" w:color="D3D3D3"/>
               <w:end w:val="single" w:space="0" w:color="D3D3D3"/>
             </w:tcBorders>
+            <w:shd w:val="clear" w:color="auto" w:fill="FCF3CF"/>
           </w:tcPr>
           <w:p>
             <w:pPr>
@@ -314,47 +215,21 @@
               <w:rPr>
                 <w:rFonts w:ascii="Calibri" w:hAnsi="Calibri"/>
                 <w:sz w:val="20"/>
-                <w:color w:val="BEBEBE"/>
-                <w:i/>
-              </w:rPr>
-              <w:t xml:space="default">00QM3ZZ</w:t>
-            </w:r>
-          </w:p>
-        </w:tc>
-        <w:tc>
-          <w:tcPr>
-            <w:tcBorders>
-              <w:top w:val="single" w:space="0" w:color="D3D3D3"/>
-              <w:bottom w:val="single" w:space="0" w:color="D3D3D3"/>
-              <w:start w:val="single" w:space="0" w:color="D3D3D3"/>
-              <w:end w:val="single" w:space="0" w:color="D3D3D3"/>
-            </w:tcBorders>
-          </w:tcPr>
-          <w:p>
-            <w:pPr>
-              <w:spacing w:before="0" w:after="60"/>
-              <w:keepNext/>
-              <w:jc w:val="start"/>
-            </w:pPr>
-            <w:r>
-              <w:rPr>
-                <w:rFonts w:ascii="Calibri" w:hAnsi="Calibri"/>
-                <w:sz w:val="20"/>
-                <w:color w:val="BEBEBE"/>
-                <w:i/>
-              </w:rPr>
-              <w:t xml:space="default">Repair Facial Nerve, Percutaneous Approach (CNS section — incorrect)</w:t>
-            </w:r>
-          </w:p>
-        </w:tc>
-        <w:tc>
-          <w:tcPr>
-            <w:tcBorders>
-              <w:top w:val="single" w:space="0" w:color="D3D3D3"/>
-              <w:bottom w:val="single" w:space="0" w:color="D3D3D3"/>
-              <w:start w:val="single" w:space="0" w:color="D3D3D3"/>
-              <w:end w:val="single" w:space="0" w:color="D3D3D3"/>
-            </w:tcBorders>
+                <w:b w:val="true"/>
+              </w:rPr>
+              <w:t xml:space="default">Total inpatient facial nerve repair (any PCS code)</w:t>
+            </w:r>
+          </w:p>
+        </w:tc>
+        <w:tc>
+          <w:tcPr>
+            <w:tcBorders>
+              <w:top w:val="single" w:space="0" w:color="D3D3D3"/>
+              <w:bottom w:val="single" w:space="0" w:color="D3D3D3"/>
+              <w:start w:val="single" w:space="0" w:color="D3D3D3"/>
+              <w:end w:val="single" w:space="0" w:color="D3D3D3"/>
+            </w:tcBorders>
+            <w:shd w:val="clear" w:color="auto" w:fill="FCF3CF"/>
           </w:tcPr>
           <w:p>
             <w:pPr>
@@ -366,21 +241,21 @@
               <w:rPr>
                 <w:rFonts w:ascii="Calibri" w:hAnsi="Calibri"/>
                 <w:sz w:val="20"/>
-                <w:color w:val="BEBEBE"/>
-                <w:i/>
-              </w:rPr>
-              <w:t xml:space="default">0</w:t>
-            </w:r>
-          </w:p>
-        </w:tc>
-        <w:tc>
-          <w:tcPr>
-            <w:tcBorders>
-              <w:top w:val="single" w:space="0" w:color="D3D3D3"/>
-              <w:bottom w:val="single" w:space="0" w:color="D3D3D3"/>
-              <w:start w:val="single" w:space="0" w:color="D3D3D3"/>
-              <w:end w:val="single" w:space="0" w:color="D3D3D3"/>
-            </w:tcBorders>
+                <w:b w:val="true"/>
+              </w:rPr>
+              <w:t xml:space="default">57</w:t>
+            </w:r>
+          </w:p>
+        </w:tc>
+        <w:tc>
+          <w:tcPr>
+            <w:tcBorders>
+              <w:top w:val="single" w:space="0" w:color="D3D3D3"/>
+              <w:bottom w:val="single" w:space="0" w:color="D3D3D3"/>
+              <w:start w:val="single" w:space="0" w:color="D3D3D3"/>
+              <w:end w:val="single" w:space="0" w:color="D3D3D3"/>
+            </w:tcBorders>
+            <w:shd w:val="clear" w:color="auto" w:fill="FCF3CF"/>
           </w:tcPr>
           <w:p>
             <w:pPr>
@@ -392,10 +267,9 @@
               <w:rPr>
                 <w:rFonts w:ascii="Calibri" w:hAnsi="Calibri"/>
                 <w:sz w:val="20"/>
-                <w:color w:val="BEBEBE"/>
-                <w:i/>
-              </w:rPr>
-              <w:t xml:space="default">0</w:t>
+                <w:b w:val="true"/>
+              </w:rPr>
+              <w:t xml:space="default">285</w:t>
             </w:r>
           </w:p>
         </w:tc>
@@ -423,36 +297,8 @@
               <w:rPr>
                 <w:rFonts w:ascii="Calibri" w:hAnsi="Calibri"/>
                 <w:sz w:val="20"/>
-                <w:color w:val="BEBEBE"/>
-                <w:i/>
-              </w:rPr>
-              <w:t xml:space="default">00QM4ZZ</w:t>
-            </w:r>
-          </w:p>
-        </w:tc>
-        <w:tc>
-          <w:tcPr>
-            <w:tcBorders>
-              <w:top w:val="single" w:space="0" w:color="D3D3D3"/>
-              <w:bottom w:val="single" w:space="0" w:color="D3D3D3"/>
-              <w:start w:val="single" w:space="0" w:color="D3D3D3"/>
-              <w:end w:val="single" w:space="0" w:color="D3D3D3"/>
-            </w:tcBorders>
-          </w:tcPr>
-          <w:p>
-            <w:pPr>
-              <w:spacing w:before="0" w:after="60"/>
-              <w:keepNext/>
-              <w:jc w:val="start"/>
-            </w:pPr>
-            <w:r>
-              <w:rPr>
-                <w:rFonts w:ascii="Calibri" w:hAnsi="Calibri"/>
-                <w:sz w:val="20"/>
-                <w:color w:val="BEBEBE"/>
-                <w:i/>
-              </w:rPr>
-              <w:t xml:space="default">Repair Facial Nerve, Percutaneous Endoscopic Approach (CNS section — incorrect)</w:t>
+              </w:rPr>
+              <w:t xml:space="default"> PNS section, correctly coded (01QM0/3/4ZZ)</w:t>
             </w:r>
           </w:p>
         </w:tc>
@@ -475,10 +321,8 @@
               <w:rPr>
                 <w:rFonts w:ascii="Calibri" w:hAnsi="Calibri"/>
                 <w:sz w:val="20"/>
-                <w:color w:val="BEBEBE"/>
-                <w:i/>
-              </w:rPr>
-              <w:t xml:space="default">0</w:t>
+              </w:rPr>
+              <w:t xml:space="default">—</w:t>
             </w:r>
           </w:p>
         </w:tc>
@@ -501,10 +345,8 @@
               <w:rPr>
                 <w:rFonts w:ascii="Calibri" w:hAnsi="Calibri"/>
                 <w:sz w:val="20"/>
-                <w:color w:val="BEBEBE"/>
-                <w:i/>
-              </w:rPr>
-              <w:t xml:space="default">0</w:t>
+              </w:rPr>
+              <w:t xml:space="default">15</w:t>
             </w:r>
           </w:p>
         </w:tc>
@@ -532,32 +374,10 @@
               <w:rPr>
                 <w:rFonts w:ascii="Calibri" w:hAnsi="Calibri"/>
                 <w:sz w:val="20"/>
-              </w:rPr>
-              <w:t xml:space="default">01QM0ZZ</w:t>
-            </w:r>
-          </w:p>
-        </w:tc>
-        <w:tc>
-          <w:tcPr>
-            <w:tcBorders>
-              <w:top w:val="single" w:space="0" w:color="D3D3D3"/>
-              <w:bottom w:val="single" w:space="0" w:color="D3D3D3"/>
-              <w:start w:val="single" w:space="0" w:color="D3D3D3"/>
-              <w:end w:val="single" w:space="0" w:color="D3D3D3"/>
-            </w:tcBorders>
-          </w:tcPr>
-          <w:p>
-            <w:pPr>
-              <w:spacing w:before="0" w:after="60"/>
-              <w:keepNext/>
-              <w:jc w:val="start"/>
-            </w:pPr>
-            <w:r>
-              <w:rPr>
-                <w:rFonts w:ascii="Calibri" w:hAnsi="Calibri"/>
-                <w:sz w:val="20"/>
-              </w:rPr>
-              <w:t xml:space="default">Repair Facial Nerve, Open Approach (PNS section — correct)</w:t>
+                <w:color w:val="6C3483"/>
+                <w:i/>
+              </w:rPr>
+              <w:t xml:space="default"> CNS section, miscoded (00QM0/3/4ZZ)</w:t>
             </w:r>
           </w:p>
         </w:tc>
@@ -580,8 +400,10 @@
               <w:rPr>
                 <w:rFonts w:ascii="Calibri" w:hAnsi="Calibri"/>
                 <w:sz w:val="20"/>
-              </w:rPr>
-              <w:t xml:space="default">—</w:t>
+                <w:color w:val="6C3483"/>
+                <w:i/>
+              </w:rPr>
+              <w:t xml:space="default">54</w:t>
             </w:r>
           </w:p>
         </w:tc>
@@ -604,8 +426,10 @@
               <w:rPr>
                 <w:rFonts w:ascii="Calibri" w:hAnsi="Calibri"/>
                 <w:sz w:val="20"/>
-              </w:rPr>
-              <w:t xml:space="default">—</w:t>
+                <w:color w:val="6C3483"/>
+                <w:i/>
+              </w:rPr>
+              <w:t xml:space="default">270</w:t>
             </w:r>
           </w:p>
         </w:tc>
@@ -617,96 +441,27 @@
         <w:tc>
           <w:tcPr>
             <w:tcBorders>
-              <w:top w:val="single" w:space="0" w:color="D3D3D3"/>
-              <w:bottom w:val="single" w:space="0" w:color="D3D3D3"/>
-              <w:start w:val="single" w:space="0" w:color="D3D3D3"/>
-              <w:end w:val="single" w:space="0" w:color="D3D3D3"/>
-            </w:tcBorders>
-          </w:tcPr>
-          <w:p>
-            <w:pPr>
-              <w:spacing w:before="0" w:after="60"/>
-              <w:keepNext/>
-              <w:jc w:val="start"/>
-            </w:pPr>
-            <w:r>
-              <w:rPr>
-                <w:rFonts w:ascii="Calibri" w:hAnsi="Calibri"/>
-                <w:sz w:val="20"/>
-              </w:rPr>
-              <w:t xml:space="default">01QM3ZZ</w:t>
-            </w:r>
-          </w:p>
-        </w:tc>
-        <w:tc>
-          <w:tcPr>
-            <w:tcBorders>
-              <w:top w:val="single" w:space="0" w:color="D3D3D3"/>
-              <w:bottom w:val="single" w:space="0" w:color="D3D3D3"/>
-              <w:start w:val="single" w:space="0" w:color="D3D3D3"/>
-              <w:end w:val="single" w:space="0" w:color="D3D3D3"/>
-            </w:tcBorders>
-          </w:tcPr>
-          <w:p>
-            <w:pPr>
-              <w:spacing w:before="0" w:after="60"/>
-              <w:keepNext/>
-              <w:jc w:val="start"/>
-            </w:pPr>
-            <w:r>
-              <w:rPr>
-                <w:rFonts w:ascii="Calibri" w:hAnsi="Calibri"/>
-                <w:sz w:val="20"/>
-              </w:rPr>
-              <w:t xml:space="default">Repair Facial Nerve, Percutaneous Approach (PNS section — correct)</w:t>
-            </w:r>
-          </w:p>
-        </w:tc>
-        <w:tc>
-          <w:tcPr>
-            <w:tcBorders>
-              <w:top w:val="single" w:space="0" w:color="D3D3D3"/>
-              <w:bottom w:val="single" w:space="0" w:color="D3D3D3"/>
-              <w:start w:val="single" w:space="0" w:color="D3D3D3"/>
-              <w:end w:val="single" w:space="0" w:color="D3D3D3"/>
-            </w:tcBorders>
-          </w:tcPr>
-          <w:p>
-            <w:pPr>
-              <w:spacing w:before="0" w:after="60"/>
-              <w:keepNext/>
-              <w:jc w:val="end"/>
-            </w:pPr>
-            <w:r>
-              <w:rPr>
-                <w:rFonts w:ascii="Calibri" w:hAnsi="Calibri"/>
-                <w:sz w:val="20"/>
-              </w:rPr>
-              <w:t xml:space="default">—</w:t>
-            </w:r>
-          </w:p>
-        </w:tc>
-        <w:tc>
-          <w:tcPr>
-            <w:tcBorders>
-              <w:top w:val="single" w:space="0" w:color="D3D3D3"/>
-              <w:bottom w:val="single" w:space="0" w:color="D3D3D3"/>
-              <w:start w:val="single" w:space="0" w:color="D3D3D3"/>
-              <w:end w:val="single" w:space="0" w:color="D3D3D3"/>
-            </w:tcBorders>
-          </w:tcPr>
-          <w:p>
-            <w:pPr>
-              <w:spacing w:before="0" w:after="60"/>
-              <w:keepNext/>
-              <w:jc w:val="end"/>
-            </w:pPr>
-            <w:r>
-              <w:rPr>
-                <w:rFonts w:ascii="Calibri" w:hAnsi="Calibri"/>
-                <w:sz w:val="20"/>
-              </w:rPr>
-              <w:t xml:space="default">—</w:t>
+              <w:top w:val="single" w:sz="16" w:space="0" w:color="D3D3D3"/>
+              <w:bottom w:val="single" w:sz="16" w:space="0" w:color="D3D3D3"/>
+              <w:start w:val="single" w:space="0" w:color="D3D3D3"/>
+              <w:end w:val="single" w:space="0" w:color="D3D3D3"/>
+            </w:tcBorders>
+            <w:tcMar>
+              <w:top w:w="25" w:type="dxa"/>
+            </w:tcMar>
+            <w:gridSpan w:val="3"/>
+          </w:tcPr>
+          <w:p>
+            <w:pPr>
+              <w:spacing w:before="0" w:after="60"/>
+              <w:keepNext/>
+            </w:pPr>
+            <w:r>
+              <w:rPr>
+                <w:rFonts w:ascii="Calibri" w:hAnsi="Calibri"/>
+                <w:sz w:val="20"/>
+              </w:rPr>
+              <w:t xml:space="default">TRAUMATIC SUBSET</w:t>
             </w:r>
           </w:p>
         </w:tc>
@@ -723,6 +478,7 @@
               <w:start w:val="single" w:space="0" w:color="D3D3D3"/>
               <w:end w:val="single" w:space="0" w:color="D3D3D3"/>
             </w:tcBorders>
+            <w:shd w:val="clear" w:color="auto" w:fill="D5F5E3"/>
           </w:tcPr>
           <w:p>
             <w:pPr>
@@ -734,43 +490,21 @@
               <w:rPr>
                 <w:rFonts w:ascii="Calibri" w:hAnsi="Calibri"/>
                 <w:sz w:val="20"/>
-              </w:rPr>
-              <w:t xml:space="default">01QM4ZZ</w:t>
-            </w:r>
-          </w:p>
-        </w:tc>
-        <w:tc>
-          <w:tcPr>
-            <w:tcBorders>
-              <w:top w:val="single" w:space="0" w:color="D3D3D3"/>
-              <w:bottom w:val="single" w:space="0" w:color="D3D3D3"/>
-              <w:start w:val="single" w:space="0" w:color="D3D3D3"/>
-              <w:end w:val="single" w:space="0" w:color="D3D3D3"/>
-            </w:tcBorders>
-          </w:tcPr>
-          <w:p>
-            <w:pPr>
-              <w:spacing w:before="0" w:after="60"/>
-              <w:keepNext/>
-              <w:jc w:val="start"/>
-            </w:pPr>
-            <w:r>
-              <w:rPr>
-                <w:rFonts w:ascii="Calibri" w:hAnsi="Calibri"/>
-                <w:sz w:val="20"/>
-              </w:rPr>
-              <w:t xml:space="default">Repair Facial Nerve, Percutaneous Endoscopic Approach (PNS section — correct)</w:t>
-            </w:r>
-          </w:p>
-        </w:tc>
-        <w:tc>
-          <w:tcPr>
-            <w:tcBorders>
-              <w:top w:val="single" w:space="0" w:color="D3D3D3"/>
-              <w:bottom w:val="single" w:space="0" w:color="D3D3D3"/>
-              <w:start w:val="single" w:space="0" w:color="D3D3D3"/>
-              <w:end w:val="single" w:space="0" w:color="D3D3D3"/>
-            </w:tcBorders>
+                <w:b w:val="true"/>
+              </w:rPr>
+              <w:t xml:space="default">Traumatic union (any of S04.5, S01.4/S01.8, V01–Y99)</w:t>
+            </w:r>
+          </w:p>
+        </w:tc>
+        <w:tc>
+          <w:tcPr>
+            <w:tcBorders>
+              <w:top w:val="single" w:space="0" w:color="D3D3D3"/>
+              <w:bottom w:val="single" w:space="0" w:color="D3D3D3"/>
+              <w:start w:val="single" w:space="0" w:color="D3D3D3"/>
+              <w:end w:val="single" w:space="0" w:color="D3D3D3"/>
+            </w:tcBorders>
+            <w:shd w:val="clear" w:color="auto" w:fill="D5F5E3"/>
           </w:tcPr>
           <w:p>
             <w:pPr>
@@ -782,19 +516,21 @@
               <w:rPr>
                 <w:rFonts w:ascii="Calibri" w:hAnsi="Calibri"/>
                 <w:sz w:val="20"/>
-              </w:rPr>
-              <w:t xml:space="default">—</w:t>
-            </w:r>
-          </w:p>
-        </w:tc>
-        <w:tc>
-          <w:tcPr>
-            <w:tcBorders>
-              <w:top w:val="single" w:space="0" w:color="D3D3D3"/>
-              <w:bottom w:val="single" w:space="0" w:color="D3D3D3"/>
-              <w:start w:val="single" w:space="0" w:color="D3D3D3"/>
-              <w:end w:val="single" w:space="0" w:color="D3D3D3"/>
-            </w:tcBorders>
+                <w:b w:val="true"/>
+              </w:rPr>
+              <w:t xml:space="default">26</w:t>
+            </w:r>
+          </w:p>
+        </w:tc>
+        <w:tc>
+          <w:tcPr>
+            <w:tcBorders>
+              <w:top w:val="single" w:space="0" w:color="D3D3D3"/>
+              <w:bottom w:val="single" w:space="0" w:color="D3D3D3"/>
+              <w:start w:val="single" w:space="0" w:color="D3D3D3"/>
+              <w:end w:val="single" w:space="0" w:color="D3D3D3"/>
+            </w:tcBorders>
+            <w:shd w:val="clear" w:color="auto" w:fill="D5F5E3"/>
           </w:tcPr>
           <w:p>
             <w:pPr>
@@ -806,8 +542,9 @@
               <w:rPr>
                 <w:rFonts w:ascii="Calibri" w:hAnsi="Calibri"/>
                 <w:sz w:val="20"/>
-              </w:rPr>
-              <w:t xml:space="default">—</w:t>
+                <w:b w:val="true"/>
+              </w:rPr>
+              <w:t xml:space="default">130</w:t>
             </w:r>
           </w:p>
         </w:tc>
@@ -824,7 +561,6 @@
               <w:start w:val="single" w:space="0" w:color="D3D3D3"/>
               <w:end w:val="single" w:space="0" w:color="D3D3D3"/>
             </w:tcBorders>
-            <w:shd w:val="clear" w:color="auto" w:fill="EBF4FB"/>
           </w:tcPr>
           <w:p>
             <w:pPr>
@@ -836,47 +572,19 @@
               <w:rPr>
                 <w:rFonts w:ascii="Calibri" w:hAnsi="Calibri"/>
                 <w:sz w:val="20"/>
-                <w:b w:val="true"/>
-              </w:rPr>
-              <w:t xml:space="default">TOTAL (PNS codes)</w:t>
-            </w:r>
-          </w:p>
-        </w:tc>
-        <w:tc>
-          <w:tcPr>
-            <w:tcBorders>
-              <w:top w:val="single" w:space="0" w:color="D3D3D3"/>
-              <w:bottom w:val="single" w:space="0" w:color="D3D3D3"/>
-              <w:start w:val="single" w:space="0" w:color="D3D3D3"/>
-              <w:end w:val="single" w:space="0" w:color="D3D3D3"/>
-            </w:tcBorders>
-            <w:shd w:val="clear" w:color="auto" w:fill="EBF4FB"/>
-          </w:tcPr>
-          <w:p>
-            <w:pPr>
-              <w:spacing w:before="0" w:after="60"/>
-              <w:keepNext/>
-              <w:jc w:val="start"/>
-            </w:pPr>
-            <w:r>
-              <w:rPr>
-                <w:rFonts w:ascii="Calibri" w:hAnsi="Calibri"/>
-                <w:sz w:val="20"/>
-                <w:b w:val="true"/>
-              </w:rPr>
-              <w:t xml:space="default">All three PNS facial nerve repair codes combined</w:t>
-            </w:r>
-          </w:p>
-        </w:tc>
-        <w:tc>
-          <w:tcPr>
-            <w:tcBorders>
-              <w:top w:val="single" w:space="0" w:color="D3D3D3"/>
-              <w:bottom w:val="single" w:space="0" w:color="D3D3D3"/>
-              <w:start w:val="single" w:space="0" w:color="D3D3D3"/>
-              <w:end w:val="single" w:space="0" w:color="D3D3D3"/>
-            </w:tcBorders>
-            <w:shd w:val="clear" w:color="auto" w:fill="EBF4FB"/>
+              </w:rPr>
+              <w:t xml:space="default"> Per-criterion: facial nerve injury dx (S04.5*)</w:t>
+            </w:r>
+          </w:p>
+        </w:tc>
+        <w:tc>
+          <w:tcPr>
+            <w:tcBorders>
+              <w:top w:val="single" w:space="0" w:color="D3D3D3"/>
+              <w:bottom w:val="single" w:space="0" w:color="D3D3D3"/>
+              <w:start w:val="single" w:space="0" w:color="D3D3D3"/>
+              <w:end w:val="single" w:space="0" w:color="D3D3D3"/>
+            </w:tcBorders>
           </w:tcPr>
           <w:p>
             <w:pPr>
@@ -888,21 +596,19 @@
               <w:rPr>
                 <w:rFonts w:ascii="Calibri" w:hAnsi="Calibri"/>
                 <w:sz w:val="20"/>
-                <w:b w:val="true"/>
-              </w:rPr>
-              <w:t xml:space="default">3</w:t>
-            </w:r>
-          </w:p>
-        </w:tc>
-        <w:tc>
-          <w:tcPr>
-            <w:tcBorders>
-              <w:top w:val="single" w:space="0" w:color="D3D3D3"/>
-              <w:bottom w:val="single" w:space="0" w:color="D3D3D3"/>
-              <w:start w:val="single" w:space="0" w:color="D3D3D3"/>
-              <w:end w:val="single" w:space="0" w:color="D3D3D3"/>
-            </w:tcBorders>
-            <w:shd w:val="clear" w:color="auto" w:fill="EBF4FB"/>
+              </w:rPr>
+              <w:t xml:space="default">14</w:t>
+            </w:r>
+          </w:p>
+        </w:tc>
+        <w:tc>
+          <w:tcPr>
+            <w:tcBorders>
+              <w:top w:val="single" w:space="0" w:color="D3D3D3"/>
+              <w:bottom w:val="single" w:space="0" w:color="D3D3D3"/>
+              <w:start w:val="single" w:space="0" w:color="D3D3D3"/>
+              <w:end w:val="single" w:space="0" w:color="D3D3D3"/>
+            </w:tcBorders>
           </w:tcPr>
           <w:p>
             <w:pPr>
@@ -914,9 +620,8 @@
               <w:rPr>
                 <w:rFonts w:ascii="Calibri" w:hAnsi="Calibri"/>
                 <w:sz w:val="20"/>
-                <w:b w:val="true"/>
-              </w:rPr>
-              <w:t xml:space="default">15</w:t>
+              </w:rPr>
+              <w:t xml:space="default">70</w:t>
             </w:r>
           </w:p>
         </w:tc>
@@ -927,19 +632,448 @@
         </w:trPr>
         <w:tc>
           <w:tcPr>
-            <w:gridSpan w:val="4"/>
-          </w:tcPr>
-          <w:p>
-            <w:pPr>
-              <w:spacing w:before="0" w:after="60"/>
-              <w:keepNext/>
-            </w:pPr>
-            <w:r>
-              <w:rPr>
-                <w:rFonts w:ascii="Calibri" w:hAnsi="Calibri"/>
-                <w:sz w:val="20"/>
-              </w:rPr>
-              <w:t xml:space="preserve">ICD-10-PCS codes searched in PNS section (01QM0/3/4ZZ) and CNS section (00QM0/3/4ZZ). Individual PNS code breakdown suppressed per HCUP cell size restrictions (&lt;11 per cell). Weighted estimate uses NIS DISCWT. Finding confirms facial nerve repair is predominantly ambulatory; NASS is the appropriate primary database.</w:t>
+            <w:tcBorders>
+              <w:top w:val="single" w:space="0" w:color="D3D3D3"/>
+              <w:bottom w:val="single" w:space="0" w:color="D3D3D3"/>
+              <w:start w:val="single" w:space="0" w:color="D3D3D3"/>
+              <w:end w:val="single" w:space="0" w:color="D3D3D3"/>
+            </w:tcBorders>
+          </w:tcPr>
+          <w:p>
+            <w:pPr>
+              <w:spacing w:before="0" w:after="60"/>
+              <w:keepNext/>
+              <w:jc w:val="start"/>
+            </w:pPr>
+            <w:r>
+              <w:rPr>
+                <w:rFonts w:ascii="Calibri" w:hAnsi="Calibri"/>
+                <w:sz w:val="20"/>
+              </w:rPr>
+              <w:t xml:space="default"> Per-criterion: facial laceration dx (S01.4*/S01.8*)</w:t>
+            </w:r>
+          </w:p>
+        </w:tc>
+        <w:tc>
+          <w:tcPr>
+            <w:tcBorders>
+              <w:top w:val="single" w:space="0" w:color="D3D3D3"/>
+              <w:bottom w:val="single" w:space="0" w:color="D3D3D3"/>
+              <w:start w:val="single" w:space="0" w:color="D3D3D3"/>
+              <w:end w:val="single" w:space="0" w:color="D3D3D3"/>
+            </w:tcBorders>
+          </w:tcPr>
+          <w:p>
+            <w:pPr>
+              <w:spacing w:before="0" w:after="60"/>
+              <w:keepNext/>
+              <w:jc w:val="end"/>
+            </w:pPr>
+            <w:r>
+              <w:rPr>
+                <w:rFonts w:ascii="Calibri" w:hAnsi="Calibri"/>
+                <w:sz w:val="20"/>
+              </w:rPr>
+              <w:t xml:space="default">14</w:t>
+            </w:r>
+          </w:p>
+        </w:tc>
+        <w:tc>
+          <w:tcPr>
+            <w:tcBorders>
+              <w:top w:val="single" w:space="0" w:color="D3D3D3"/>
+              <w:bottom w:val="single" w:space="0" w:color="D3D3D3"/>
+              <w:start w:val="single" w:space="0" w:color="D3D3D3"/>
+              <w:end w:val="single" w:space="0" w:color="D3D3D3"/>
+            </w:tcBorders>
+          </w:tcPr>
+          <w:p>
+            <w:pPr>
+              <w:spacing w:before="0" w:after="60"/>
+              <w:keepNext/>
+              <w:jc w:val="end"/>
+            </w:pPr>
+            <w:r>
+              <w:rPr>
+                <w:rFonts w:ascii="Calibri" w:hAnsi="Calibri"/>
+                <w:sz w:val="20"/>
+              </w:rPr>
+              <w:t xml:space="default">70</w:t>
+            </w:r>
+          </w:p>
+        </w:tc>
+      </w:tr>
+      <w:tr>
+        <w:trPr>
+          <w:cantSplit/>
+        </w:trPr>
+        <w:tc>
+          <w:tcPr>
+            <w:tcBorders>
+              <w:top w:val="single" w:space="0" w:color="D3D3D3"/>
+              <w:bottom w:val="single" w:space="0" w:color="D3D3D3"/>
+              <w:start w:val="single" w:space="0" w:color="D3D3D3"/>
+              <w:end w:val="single" w:space="0" w:color="D3D3D3"/>
+            </w:tcBorders>
+          </w:tcPr>
+          <w:p>
+            <w:pPr>
+              <w:spacing w:before="0" w:after="60"/>
+              <w:keepNext/>
+              <w:jc w:val="start"/>
+            </w:pPr>
+            <w:r>
+              <w:rPr>
+                <w:rFonts w:ascii="Calibri" w:hAnsi="Calibri"/>
+                <w:sz w:val="20"/>
+              </w:rPr>
+              <w:t xml:space="default"> Per-criterion: external cause code (V01–Y99)</w:t>
+            </w:r>
+          </w:p>
+        </w:tc>
+        <w:tc>
+          <w:tcPr>
+            <w:tcBorders>
+              <w:top w:val="single" w:space="0" w:color="D3D3D3"/>
+              <w:bottom w:val="single" w:space="0" w:color="D3D3D3"/>
+              <w:start w:val="single" w:space="0" w:color="D3D3D3"/>
+              <w:end w:val="single" w:space="0" w:color="D3D3D3"/>
+            </w:tcBorders>
+          </w:tcPr>
+          <w:p>
+            <w:pPr>
+              <w:spacing w:before="0" w:after="60"/>
+              <w:keepNext/>
+              <w:jc w:val="end"/>
+            </w:pPr>
+            <w:r>
+              <w:rPr>
+                <w:rFonts w:ascii="Calibri" w:hAnsi="Calibri"/>
+                <w:sz w:val="20"/>
+              </w:rPr>
+              <w:t xml:space="default">24</w:t>
+            </w:r>
+          </w:p>
+        </w:tc>
+        <w:tc>
+          <w:tcPr>
+            <w:tcBorders>
+              <w:top w:val="single" w:space="0" w:color="D3D3D3"/>
+              <w:bottom w:val="single" w:space="0" w:color="D3D3D3"/>
+              <w:start w:val="single" w:space="0" w:color="D3D3D3"/>
+              <w:end w:val="single" w:space="0" w:color="D3D3D3"/>
+            </w:tcBorders>
+          </w:tcPr>
+          <w:p>
+            <w:pPr>
+              <w:spacing w:before="0" w:after="60"/>
+              <w:keepNext/>
+              <w:jc w:val="end"/>
+            </w:pPr>
+            <w:r>
+              <w:rPr>
+                <w:rFonts w:ascii="Calibri" w:hAnsi="Calibri"/>
+                <w:sz w:val="20"/>
+              </w:rPr>
+              <w:t xml:space="default">120</w:t>
+            </w:r>
+          </w:p>
+        </w:tc>
+      </w:tr>
+      <w:tr>
+        <w:trPr>
+          <w:cantSplit/>
+        </w:trPr>
+        <w:tc>
+          <w:tcPr>
+            <w:tcBorders>
+              <w:top w:val="single" w:space="0" w:color="D3D3D3"/>
+              <w:bottom w:val="single" w:space="0" w:color="D3D3D3"/>
+              <w:start w:val="single" w:space="0" w:color="D3D3D3"/>
+              <w:end w:val="single" w:space="0" w:color="D3D3D3"/>
+            </w:tcBorders>
+          </w:tcPr>
+          <w:p>
+            <w:pPr>
+              <w:spacing w:before="0" w:after="60"/>
+              <w:keepNext/>
+              <w:jc w:val="start"/>
+            </w:pPr>
+            <w:r>
+              <w:rPr>
+                <w:rFonts w:ascii="Calibri" w:hAnsi="Calibri"/>
+                <w:sz w:val="20"/>
+                <w:color w:val="6C3483"/>
+                <w:i/>
+              </w:rPr>
+              <w:t xml:space="default"> Of which: CNS-miscoded (00QM)</w:t>
+            </w:r>
+          </w:p>
+        </w:tc>
+        <w:tc>
+          <w:tcPr>
+            <w:tcBorders>
+              <w:top w:val="single" w:space="0" w:color="D3D3D3"/>
+              <w:bottom w:val="single" w:space="0" w:color="D3D3D3"/>
+              <w:start w:val="single" w:space="0" w:color="D3D3D3"/>
+              <w:end w:val="single" w:space="0" w:color="D3D3D3"/>
+            </w:tcBorders>
+          </w:tcPr>
+          <w:p>
+            <w:pPr>
+              <w:spacing w:before="0" w:after="60"/>
+              <w:keepNext/>
+              <w:jc w:val="end"/>
+            </w:pPr>
+            <w:r>
+              <w:rPr>
+                <w:rFonts w:ascii="Calibri" w:hAnsi="Calibri"/>
+                <w:sz w:val="20"/>
+                <w:color w:val="6C3483"/>
+                <w:i/>
+              </w:rPr>
+              <w:t xml:space="default">25</w:t>
+            </w:r>
+          </w:p>
+        </w:tc>
+        <w:tc>
+          <w:tcPr>
+            <w:tcBorders>
+              <w:top w:val="single" w:space="0" w:color="D3D3D3"/>
+              <w:bottom w:val="single" w:space="0" w:color="D3D3D3"/>
+              <w:start w:val="single" w:space="0" w:color="D3D3D3"/>
+              <w:end w:val="single" w:space="0" w:color="D3D3D3"/>
+            </w:tcBorders>
+          </w:tcPr>
+          <w:p>
+            <w:pPr>
+              <w:spacing w:before="0" w:after="60"/>
+              <w:keepNext/>
+              <w:jc w:val="end"/>
+            </w:pPr>
+            <w:r>
+              <w:rPr>
+                <w:rFonts w:ascii="Calibri" w:hAnsi="Calibri"/>
+                <w:sz w:val="20"/>
+                <w:color w:val="6C3483"/>
+                <w:i/>
+              </w:rPr>
+              <w:t xml:space="default">125</w:t>
+            </w:r>
+          </w:p>
+        </w:tc>
+      </w:tr>
+      <w:tr>
+        <w:trPr>
+          <w:cantSplit/>
+        </w:trPr>
+        <w:tc>
+          <w:tcPr>
+            <w:tcBorders>
+              <w:top w:val="single" w:space="0" w:color="D3D3D3"/>
+              <w:bottom w:val="single" w:space="0" w:color="D3D3D3"/>
+              <w:start w:val="single" w:space="0" w:color="D3D3D3"/>
+              <w:end w:val="single" w:space="0" w:color="D3D3D3"/>
+            </w:tcBorders>
+          </w:tcPr>
+          <w:p>
+            <w:pPr>
+              <w:spacing w:before="0" w:after="60"/>
+              <w:keepNext/>
+              <w:jc w:val="start"/>
+            </w:pPr>
+            <w:r>
+              <w:rPr>
+                <w:rFonts w:ascii="Calibri" w:hAnsi="Calibri"/>
+                <w:sz w:val="20"/>
+              </w:rPr>
+              <w:t xml:space="default"> Of which: PNS-correctly-coded (01QM)</w:t>
+            </w:r>
+          </w:p>
+        </w:tc>
+        <w:tc>
+          <w:tcPr>
+            <w:tcBorders>
+              <w:top w:val="single" w:space="0" w:color="D3D3D3"/>
+              <w:bottom w:val="single" w:space="0" w:color="D3D3D3"/>
+              <w:start w:val="single" w:space="0" w:color="D3D3D3"/>
+              <w:end w:val="single" w:space="0" w:color="D3D3D3"/>
+            </w:tcBorders>
+          </w:tcPr>
+          <w:p>
+            <w:pPr>
+              <w:spacing w:before="0" w:after="60"/>
+              <w:keepNext/>
+              <w:jc w:val="end"/>
+            </w:pPr>
+            <w:r>
+              <w:rPr>
+                <w:rFonts w:ascii="Calibri" w:hAnsi="Calibri"/>
+                <w:sz w:val="20"/>
+              </w:rPr>
+              <w:t xml:space="default">—</w:t>
+            </w:r>
+          </w:p>
+        </w:tc>
+        <w:tc>
+          <w:tcPr>
+            <w:tcBorders>
+              <w:top w:val="single" w:space="0" w:color="D3D3D3"/>
+              <w:bottom w:val="single" w:space="0" w:color="D3D3D3"/>
+              <w:start w:val="single" w:space="0" w:color="D3D3D3"/>
+              <w:end w:val="single" w:space="0" w:color="D3D3D3"/>
+            </w:tcBorders>
+          </w:tcPr>
+          <w:p>
+            <w:pPr>
+              <w:spacing w:before="0" w:after="60"/>
+              <w:keepNext/>
+              <w:jc w:val="end"/>
+            </w:pPr>
+            <w:r>
+              <w:rPr>
+                <w:rFonts w:ascii="Calibri" w:hAnsi="Calibri"/>
+                <w:sz w:val="20"/>
+              </w:rPr>
+              <w:t xml:space="default">5</w:t>
+            </w:r>
+          </w:p>
+        </w:tc>
+      </w:tr>
+      <w:tr>
+        <w:trPr>
+          <w:cantSplit/>
+        </w:trPr>
+        <w:tc>
+          <w:tcPr>
+            <w:tcBorders>
+              <w:top w:val="single" w:sz="16" w:space="0" w:color="D3D3D3"/>
+              <w:bottom w:val="single" w:sz="16" w:space="0" w:color="D3D3D3"/>
+              <w:start w:val="single" w:space="0" w:color="D3D3D3"/>
+              <w:end w:val="single" w:space="0" w:color="D3D3D3"/>
+            </w:tcBorders>
+            <w:tcMar>
+              <w:top w:w="25" w:type="dxa"/>
+            </w:tcMar>
+            <w:gridSpan w:val="3"/>
+          </w:tcPr>
+          <w:p>
+            <w:pPr>
+              <w:spacing w:before="0" w:after="60"/>
+              <w:keepNext/>
+            </w:pPr>
+            <w:r>
+              <w:rPr>
+                <w:rFonts w:ascii="Calibri" w:hAnsi="Calibri"/>
+                <w:sz w:val="20"/>
+              </w:rPr>
+              <w:t xml:space="default">NON-TRAUMATIC SUBSET</w:t>
+            </w:r>
+          </w:p>
+        </w:tc>
+      </w:tr>
+      <w:tr>
+        <w:trPr>
+          <w:cantSplit/>
+        </w:trPr>
+        <w:tc>
+          <w:tcPr>
+            <w:tcBorders>
+              <w:top w:val="single" w:space="0" w:color="D3D3D3"/>
+              <w:bottom w:val="single" w:space="0" w:color="D3D3D3"/>
+              <w:start w:val="single" w:space="0" w:color="D3D3D3"/>
+              <w:end w:val="single" w:space="0" w:color="D3D3D3"/>
+            </w:tcBorders>
+            <w:shd w:val="clear" w:color="auto" w:fill="E8DAEF"/>
+          </w:tcPr>
+          <w:p>
+            <w:pPr>
+              <w:spacing w:before="0" w:after="60"/>
+              <w:keepNext/>
+              <w:jc w:val="start"/>
+            </w:pPr>
+            <w:r>
+              <w:rPr>
+                <w:rFonts w:ascii="Calibri" w:hAnsi="Calibri"/>
+                <w:sz w:val="20"/>
+                <w:b w:val="true"/>
+              </w:rPr>
+              <w:t xml:space="default">Non-traumatic remainder (elective / oncologic / iatrogenic)</w:t>
+            </w:r>
+          </w:p>
+        </w:tc>
+        <w:tc>
+          <w:tcPr>
+            <w:tcBorders>
+              <w:top w:val="single" w:space="0" w:color="D3D3D3"/>
+              <w:bottom w:val="single" w:space="0" w:color="D3D3D3"/>
+              <w:start w:val="single" w:space="0" w:color="D3D3D3"/>
+              <w:end w:val="single" w:space="0" w:color="D3D3D3"/>
+            </w:tcBorders>
+            <w:shd w:val="clear" w:color="auto" w:fill="E8DAEF"/>
+          </w:tcPr>
+          <w:p>
+            <w:pPr>
+              <w:spacing w:before="0" w:after="60"/>
+              <w:keepNext/>
+              <w:jc w:val="end"/>
+            </w:pPr>
+            <w:r>
+              <w:rPr>
+                <w:rFonts w:ascii="Calibri" w:hAnsi="Calibri"/>
+                <w:sz w:val="20"/>
+                <w:b w:val="true"/>
+              </w:rPr>
+              <w:t xml:space="default">31</w:t>
+            </w:r>
+          </w:p>
+        </w:tc>
+        <w:tc>
+          <w:tcPr>
+            <w:tcBorders>
+              <w:top w:val="single" w:space="0" w:color="D3D3D3"/>
+              <w:bottom w:val="single" w:space="0" w:color="D3D3D3"/>
+              <w:start w:val="single" w:space="0" w:color="D3D3D3"/>
+              <w:end w:val="single" w:space="0" w:color="D3D3D3"/>
+            </w:tcBorders>
+            <w:shd w:val="clear" w:color="auto" w:fill="E8DAEF"/>
+          </w:tcPr>
+          <w:p>
+            <w:pPr>
+              <w:spacing w:before="0" w:after="60"/>
+              <w:keepNext/>
+              <w:jc w:val="end"/>
+            </w:pPr>
+            <w:r>
+              <w:rPr>
+                <w:rFonts w:ascii="Calibri" w:hAnsi="Calibri"/>
+                <w:sz w:val="20"/>
+                <w:b w:val="true"/>
+              </w:rPr>
+              <w:t xml:space="default">155</w:t>
+            </w:r>
+          </w:p>
+        </w:tc>
+      </w:tr>
+      <w:tr>
+        <w:trPr>
+          <w:cantSplit/>
+        </w:trPr>
+        <w:tc>
+          <w:tcPr>
+            <w:gridSpan w:val="3"/>
+          </w:tcPr>
+          <w:p>
+            <w:pPr>
+              <w:spacing w:before="0" w:after="60"/>
+              <w:keepNext/>
+            </w:pPr>
+            <w:r>
+              <w:rPr>
+                <w:rFonts w:ascii="Calibri" w:hAnsi="Calibri"/>
+                <w:sz w:val="20"/>
+              </w:rPr>
+              <w:t xml:space="preserve">Survey-weighted national estimates (DISCWT, NIS_STRATUM, HOSP_NIS, nest=TRUE). Total inpatient burden of any facial nerve repair = 285 weighted, of which 270 (94.7%) were coded to the CNS section (00QM) instead of the correct PNS section (01QM) under ICD-10-PCS. The miscoding hypothesis was confirmed in v1.1 by diagnosis-profile analysis (75.9% of CNS cases carry a facial-nerve-consistent diagnosis, exceeding 70% threshold). Traumatic subset = 130 weighted (45.6% of all repair) defined as the deduplicated union of S04.5, S01.4/S01.8, and external cause codes V01–Y99. Of traumatic cases, 96.2% are CNS-miscoded. Per HCUP DUA, unweighted counts &lt;11 are suppressed (NA). The 94.7% miscoding pattern is a novel, confirmed data-quality finding for the manuscript Discussion. NASS remains the primary database; NIS is reported as a descriptive comparator only.</w:t>
             </w:r>
           </w:p>
         </w:tc>

</xml_diff>